<commit_message>
Update all 5 learning DOCX documents with comprehensive line-by-line code explanations
</commit_message>
<xml_diff>
--- a/1_Quan_Ly_Hoa_Don.docx
+++ b/1_Quan_Ly_Hoa_Don.docx
@@ -14,7 +14,7 @@
           <w:color w:val="B45309"/>
           <w:sz w:val="44"/>
         </w:rPr>
-        <w:t>TÀI LIỆU HỌC TẬP - TÌM HIỂU MÃ NGUỒN (FILE 1)</w:t>
+        <w:t>TÀI LIỆU CHI TIẾT MÃ NGUỒN (FILE 1)</w:t>
       </w:r>
     </w:p>
     <w:p>
@@ -29,13 +29,13 @@
           <w:color w:val="64748B"/>
           <w:sz w:val="24"/>
         </w:rPr>
-        <w:t>Chức Năng Quản Lý Hóa Đơn, Tạo Đơn Hàng POS &amp; Chi Tiết Hóa Đơn</w:t>
+        <w:t>Chức Năng Quản Lý Hóa Đơn, Bán Hàng POS &amp; Chi Tiết Đơn Hàng</w:t>
       </w:r>
     </w:p>
     <w:p>
       <w:pPr>
         <w:pStyle w:val="Heading1"/>
-        <w:spacing w:before="240" w:after="120"/>
+        <w:spacing w:before="280" w:after="120"/>
       </w:pPr>
       <w:r>
         <w:rPr>
@@ -44,34 +44,18 @@
           <w:color w:val="D97706"/>
           <w:sz w:val="36"/>
         </w:rPr>
-        <w:t>1. Tổng Quan Chức Năng Quản Lý Hóa Đơn &amp; POS</w:t>
+        <w:t>CHƯƠNG 1: TỔNG QUAN LUỒNG NGHIỆP VỤ HÓA ĐƠN</w:t>
       </w:r>
     </w:p>
     <w:p>
       <w:r>
-        <w:t>Chức năng Quản lý Hóa đơn &amp; Bán hàng POS bao gồm hai nghiệp vụ chính:</w:t>
-      </w:r>
-    </w:p>
-    <w:p>
-      <w:pPr>
-        <w:pStyle w:val="ListBullet"/>
-      </w:pPr>
-      <w:r>
-        <w:t>• Giao diện POS Bán Hàng Trực Tiếp: Nhân viên chọn món ăn từ thực đơn, chọn các topping kèm theo, chọn hình thức thanh toán (Tiền mặt / Chuyển khoản) và nhấn 'Thanh Toán &amp; In Hóa Đơn'.</w:t>
-      </w:r>
-    </w:p>
-    <w:p>
-      <w:pPr>
-        <w:pStyle w:val="ListBullet"/>
-      </w:pPr>
-      <w:r>
-        <w:t>• Xem Chi Tiết Hóa Đơn: Khách hàng hoặc người quản lý có thể mở xem lại từng hóa đơn đã tạo, bao gồm thông tin chi tiết từng món ăn, giá tiền, topping và nhân viên phụ trách.</w:t>
+        <w:t>Module Hóa Đơn chịu trách nhiệm tạo lập đơn hàng từ giao diện POS, lưu trữ CSDL SQL Server và truy xuất xem lại chi tiết từng hóa đơn.</w:t>
       </w:r>
     </w:p>
     <w:p>
       <w:pPr>
         <w:pStyle w:val="Heading1"/>
-        <w:spacing w:before="240" w:after="120"/>
+        <w:spacing w:before="280" w:after="120"/>
       </w:pPr>
       <w:r>
         <w:rPr>
@@ -80,487 +64,13 @@
           <w:color w:val="D97706"/>
           <w:sz w:val="36"/>
         </w:rPr>
-        <w:t>2. Sơ Đồ Cấu Trúc File &amp; Vị Trí Trong Dự Án</w:t>
-      </w:r>
-    </w:p>
-    <w:tbl>
-      <w:tblPr>
-        <w:tblW w:type="auto" w:w="0"/>
-        <w:jc w:val="center"/>
-        <w:tblLook w:firstColumn="1" w:firstRow="1" w:lastColumn="0" w:lastRow="0" w:noHBand="0" w:noVBand="1" w:val="04A0"/>
-      </w:tblPr>
-      <w:tblGrid>
-        <w:gridCol w:w="3216"/>
-        <w:gridCol w:w="3216"/>
-        <w:gridCol w:w="3216"/>
-      </w:tblGrid>
-      <w:tr>
-        <w:tc>
-          <w:tcPr>
-            <w:tcW w:type="dxa" w:w="3216"/>
-            <w:shd w:fill="E2E8F0"/>
-          </w:tcPr>
-          <w:p>
-            <w:r>
-              <w:rPr>
-                <w:rFonts w:ascii="Arial" w:hAnsi="Arial"/>
-                <w:b/>
-              </w:rPr>
-              <w:t>Thành Phần (Layer)</w:t>
-            </w:r>
-          </w:p>
-        </w:tc>
-        <w:tc>
-          <w:tcPr>
-            <w:tcW w:type="dxa" w:w="3216"/>
-            <w:shd w:fill="E2E8F0"/>
-          </w:tcPr>
-          <w:p>
-            <w:r>
-              <w:rPr>
-                <w:rFonts w:ascii="Arial" w:hAnsi="Arial"/>
-                <w:b/>
-              </w:rPr>
-              <w:t>Vị Trí Đường Dẫn File (File Path)</w:t>
-            </w:r>
-          </w:p>
-        </w:tc>
-        <w:tc>
-          <w:tcPr>
-            <w:tcW w:type="dxa" w:w="3216"/>
-            <w:shd w:fill="E2E8F0"/>
-          </w:tcPr>
-          <w:p>
-            <w:r>
-              <w:rPr>
-                <w:rFonts w:ascii="Arial" w:hAnsi="Arial"/>
-                <w:b/>
-              </w:rPr>
-              <w:t>Chức Năng Chính</w:t>
-            </w:r>
-          </w:p>
-        </w:tc>
-      </w:tr>
-      <w:tr>
-        <w:tc>
-          <w:tcPr>
-            <w:tcW w:type="dxa" w:w="3216"/>
-            <w:tcMar>
-              <w:top w:w="60" w:type="dxa"/>
-              <w:bottom w:w="60" w:type="dxa"/>
-              <w:left w:w="100" w:type="dxa"/>
-              <w:right w:w="100" w:type="dxa"/>
-            </w:tcMar>
-          </w:tcPr>
-          <w:p>
-            <w:r>
-              <w:t>Giao Diện (JSP)</w:t>
-            </w:r>
-          </w:p>
-        </w:tc>
-        <w:tc>
-          <w:tcPr>
-            <w:tcW w:type="dxa" w:w="3216"/>
-            <w:tcMar>
-              <w:top w:w="60" w:type="dxa"/>
-              <w:bottom w:w="60" w:type="dxa"/>
-              <w:left w:w="100" w:type="dxa"/>
-              <w:right w:w="100" w:type="dxa"/>
-            </w:tcMar>
-          </w:tcPr>
-          <w:p>
-            <w:r>
-              <w:t>src/main/webapp/views/banhang/pos.jsp</w:t>
-            </w:r>
-          </w:p>
-        </w:tc>
-        <w:tc>
-          <w:tcPr>
-            <w:tcW w:type="dxa" w:w="3216"/>
-            <w:tcMar>
-              <w:top w:w="60" w:type="dxa"/>
-              <w:bottom w:w="60" w:type="dxa"/>
-              <w:left w:w="100" w:type="dxa"/>
-              <w:right w:w="100" w:type="dxa"/>
-            </w:tcMar>
-          </w:tcPr>
-          <w:p>
-            <w:r>
-              <w:t>Màn hình POS bán hàng, giao diện chọn món, chọn topping &amp; tính tiền</w:t>
-            </w:r>
-          </w:p>
-        </w:tc>
-      </w:tr>
-      <w:tr>
-        <w:tc>
-          <w:tcPr>
-            <w:tcW w:type="dxa" w:w="3216"/>
-            <w:tcMar>
-              <w:top w:w="60" w:type="dxa"/>
-              <w:bottom w:w="60" w:type="dxa"/>
-              <w:left w:w="100" w:type="dxa"/>
-              <w:right w:w="100" w:type="dxa"/>
-            </w:tcMar>
-          </w:tcPr>
-          <w:p>
-            <w:r>
-              <w:t>Giao Diện (JSP)</w:t>
-            </w:r>
-          </w:p>
-        </w:tc>
-        <w:tc>
-          <w:tcPr>
-            <w:tcW w:type="dxa" w:w="3216"/>
-            <w:tcMar>
-              <w:top w:w="60" w:type="dxa"/>
-              <w:bottom w:w="60" w:type="dxa"/>
-              <w:left w:w="100" w:type="dxa"/>
-              <w:right w:w="100" w:type="dxa"/>
-            </w:tcMar>
-          </w:tcPr>
-          <w:p>
-            <w:r>
-              <w:t>src/main/webapp/views/thongke/invoiceDetail.jsp</w:t>
-            </w:r>
-          </w:p>
-        </w:tc>
-        <w:tc>
-          <w:tcPr>
-            <w:tcW w:type="dxa" w:w="3216"/>
-            <w:tcMar>
-              <w:top w:w="60" w:type="dxa"/>
-              <w:bottom w:w="60" w:type="dxa"/>
-              <w:left w:w="100" w:type="dxa"/>
-              <w:right w:w="100" w:type="dxa"/>
-            </w:tcMar>
-          </w:tcPr>
-          <w:p>
-            <w:r>
-              <w:t>Màn hình xem thông tin chi tiết hóa đơn (món ăn, topping, nhân viên)</w:t>
-            </w:r>
-          </w:p>
-        </w:tc>
-      </w:tr>
-      <w:tr>
-        <w:tc>
-          <w:tcPr>
-            <w:tcW w:type="dxa" w:w="3216"/>
-            <w:tcMar>
-              <w:top w:w="60" w:type="dxa"/>
-              <w:bottom w:w="60" w:type="dxa"/>
-              <w:left w:w="100" w:type="dxa"/>
-              <w:right w:w="100" w:type="dxa"/>
-            </w:tcMar>
-          </w:tcPr>
-          <w:p>
-            <w:r>
-              <w:t>Điều Hướng (Servlet)</w:t>
-            </w:r>
-          </w:p>
-        </w:tc>
-        <w:tc>
-          <w:tcPr>
-            <w:tcW w:type="dxa" w:w="3216"/>
-            <w:tcMar>
-              <w:top w:w="60" w:type="dxa"/>
-              <w:bottom w:w="60" w:type="dxa"/>
-              <w:left w:w="100" w:type="dxa"/>
-              <w:right w:w="100" w:type="dxa"/>
-            </w:tcMar>
-          </w:tcPr>
-          <w:p>
-            <w:r>
-              <w:t>src/main/java/com/webbanhmi/servlet/BanHangServlet.java</w:t>
-            </w:r>
-          </w:p>
-        </w:tc>
-        <w:tc>
-          <w:tcPr>
-            <w:tcW w:type="dxa" w:w="3216"/>
-            <w:tcMar>
-              <w:top w:w="60" w:type="dxa"/>
-              <w:bottom w:w="60" w:type="dxa"/>
-              <w:left w:w="100" w:type="dxa"/>
-              <w:right w:w="100" w:type="dxa"/>
-            </w:tcMar>
-          </w:tcPr>
-          <w:p>
-            <w:r>
-              <w:t>Xử lý nhận danh sách món/topping từ form, tính tổng tiền và gọi DAO tạo đơn hàng</w:t>
-            </w:r>
-          </w:p>
-        </w:tc>
-      </w:tr>
-      <w:tr>
-        <w:tc>
-          <w:tcPr>
-            <w:tcW w:type="dxa" w:w="3216"/>
-            <w:tcMar>
-              <w:top w:w="60" w:type="dxa"/>
-              <w:bottom w:w="60" w:type="dxa"/>
-              <w:left w:w="100" w:type="dxa"/>
-              <w:right w:w="100" w:type="dxa"/>
-            </w:tcMar>
-          </w:tcPr>
-          <w:p>
-            <w:r>
-              <w:t>Điều Hướng (Servlet)</w:t>
-            </w:r>
-          </w:p>
-        </w:tc>
-        <w:tc>
-          <w:tcPr>
-            <w:tcW w:type="dxa" w:w="3216"/>
-            <w:tcMar>
-              <w:top w:w="60" w:type="dxa"/>
-              <w:bottom w:w="60" w:type="dxa"/>
-              <w:left w:w="100" w:type="dxa"/>
-              <w:right w:w="100" w:type="dxa"/>
-            </w:tcMar>
-          </w:tcPr>
-          <w:p>
-            <w:r>
-              <w:t>src/main/java/com/webbanhmi/servlet/InvoiceDetailServlet.java</w:t>
-            </w:r>
-          </w:p>
-        </w:tc>
-        <w:tc>
-          <w:tcPr>
-            <w:tcW w:type="dxa" w:w="3216"/>
-            <w:tcMar>
-              <w:top w:w="60" w:type="dxa"/>
-              <w:bottom w:w="60" w:type="dxa"/>
-              <w:left w:w="100" w:type="dxa"/>
-              <w:right w:w="100" w:type="dxa"/>
-            </w:tcMar>
-          </w:tcPr>
-          <w:p>
-            <w:r>
-              <w:t>Nhận ID đơn hàng, lấy dữ liệu chi tiết hóa đơn từ CSDL để hiển thị ra invoiceDetail.jsp</w:t>
-            </w:r>
-          </w:p>
-        </w:tc>
-      </w:tr>
-      <w:tr>
-        <w:tc>
-          <w:tcPr>
-            <w:tcW w:type="dxa" w:w="3216"/>
-            <w:tcMar>
-              <w:top w:w="60" w:type="dxa"/>
-              <w:bottom w:w="60" w:type="dxa"/>
-              <w:left w:w="100" w:type="dxa"/>
-              <w:right w:w="100" w:type="dxa"/>
-            </w:tcMar>
-          </w:tcPr>
-          <w:p>
-            <w:r>
-              <w:t>Truy Vấn CSDL (DAO)</w:t>
-            </w:r>
-          </w:p>
-        </w:tc>
-        <w:tc>
-          <w:tcPr>
-            <w:tcW w:type="dxa" w:w="3216"/>
-            <w:tcMar>
-              <w:top w:w="60" w:type="dxa"/>
-              <w:bottom w:w="60" w:type="dxa"/>
-              <w:left w:w="100" w:type="dxa"/>
-              <w:right w:w="100" w:type="dxa"/>
-            </w:tcMar>
-          </w:tcPr>
-          <w:p>
-            <w:r>
-              <w:t>src/main/java/com/webbanhmi/dao/DonHangDAO.java</w:t>
-            </w:r>
-          </w:p>
-        </w:tc>
-        <w:tc>
-          <w:tcPr>
-            <w:tcW w:type="dxa" w:w="3216"/>
-            <w:tcMar>
-              <w:top w:w="60" w:type="dxa"/>
-              <w:bottom w:w="60" w:type="dxa"/>
-              <w:left w:w="100" w:type="dxa"/>
-              <w:right w:w="100" w:type="dxa"/>
-            </w:tcMar>
-          </w:tcPr>
-          <w:p>
-            <w:r>
-              <w:t>Thao tác INSERT/SELECT bảng don_hang, tính tổng doanh thu &amp; sinh ID tự động</w:t>
-            </w:r>
-          </w:p>
-        </w:tc>
-      </w:tr>
-      <w:tr>
-        <w:tc>
-          <w:tcPr>
-            <w:tcW w:type="dxa" w:w="3216"/>
-            <w:tcMar>
-              <w:top w:w="60" w:type="dxa"/>
-              <w:bottom w:w="60" w:type="dxa"/>
-              <w:left w:w="100" w:type="dxa"/>
-              <w:right w:w="100" w:type="dxa"/>
-            </w:tcMar>
-          </w:tcPr>
-          <w:p>
-            <w:r>
-              <w:t>Truy Vấn CSDL (DAO)</w:t>
-            </w:r>
-          </w:p>
-        </w:tc>
-        <w:tc>
-          <w:tcPr>
-            <w:tcW w:type="dxa" w:w="3216"/>
-            <w:tcMar>
-              <w:top w:w="60" w:type="dxa"/>
-              <w:bottom w:w="60" w:type="dxa"/>
-              <w:left w:w="100" w:type="dxa"/>
-              <w:right w:w="100" w:type="dxa"/>
-            </w:tcMar>
-          </w:tcPr>
-          <w:p>
-            <w:r>
-              <w:t>src/main/java/com/webbanhmi/dao/ChiTietDonHangDAO.java</w:t>
-            </w:r>
-          </w:p>
-        </w:tc>
-        <w:tc>
-          <w:tcPr>
-            <w:tcW w:type="dxa" w:w="3216"/>
-            <w:tcMar>
-              <w:top w:w="60" w:type="dxa"/>
-              <w:bottom w:w="60" w:type="dxa"/>
-              <w:left w:w="100" w:type="dxa"/>
-              <w:right w:w="100" w:type="dxa"/>
-            </w:tcMar>
-          </w:tcPr>
-          <w:p>
-            <w:r>
-              <w:t>Thao tác INSERT/SELECT bảng chi_tiet_don_hang và chi_tiet_topping_don_hang</w:t>
-            </w:r>
-          </w:p>
-        </w:tc>
-      </w:tr>
-      <w:tr>
-        <w:tc>
-          <w:tcPr>
-            <w:tcW w:type="dxa" w:w="3216"/>
-            <w:tcMar>
-              <w:top w:w="60" w:type="dxa"/>
-              <w:bottom w:w="60" w:type="dxa"/>
-              <w:left w:w="100" w:type="dxa"/>
-              <w:right w:w="100" w:type="dxa"/>
-            </w:tcMar>
-          </w:tcPr>
-          <w:p>
-            <w:r>
-              <w:t>Đối Tượng (Entity)</w:t>
-            </w:r>
-          </w:p>
-        </w:tc>
-        <w:tc>
-          <w:tcPr>
-            <w:tcW w:type="dxa" w:w="3216"/>
-            <w:tcMar>
-              <w:top w:w="60" w:type="dxa"/>
-              <w:bottom w:w="60" w:type="dxa"/>
-              <w:left w:w="100" w:type="dxa"/>
-              <w:right w:w="100" w:type="dxa"/>
-            </w:tcMar>
-          </w:tcPr>
-          <w:p>
-            <w:r>
-              <w:t>src/main/java/com/webbanhmi/entity/DonHang.java</w:t>
-            </w:r>
-          </w:p>
-        </w:tc>
-        <w:tc>
-          <w:tcPr>
-            <w:tcW w:type="dxa" w:w="3216"/>
-            <w:tcMar>
-              <w:top w:w="60" w:type="dxa"/>
-              <w:bottom w:w="60" w:type="dxa"/>
-              <w:left w:w="100" w:type="dxa"/>
-              <w:right w:w="100" w:type="dxa"/>
-            </w:tcMar>
-          </w:tcPr>
-          <w:p>
-            <w:r>
-              <w:t>Lớp Model đại diện cho bảng don_hang (id, maSoDonHang, tongTien, ngayTao...)</w:t>
-            </w:r>
-          </w:p>
-        </w:tc>
-      </w:tr>
-      <w:tr>
-        <w:tc>
-          <w:tcPr>
-            <w:tcW w:type="dxa" w:w="3216"/>
-            <w:tcMar>
-              <w:top w:w="60" w:type="dxa"/>
-              <w:bottom w:w="60" w:type="dxa"/>
-              <w:left w:w="100" w:type="dxa"/>
-              <w:right w:w="100" w:type="dxa"/>
-            </w:tcMar>
-          </w:tcPr>
-          <w:p>
-            <w:r>
-              <w:t>Đối Tượng (Entity)</w:t>
-            </w:r>
-          </w:p>
-        </w:tc>
-        <w:tc>
-          <w:tcPr>
-            <w:tcW w:type="dxa" w:w="3216"/>
-            <w:tcMar>
-              <w:top w:w="60" w:type="dxa"/>
-              <w:bottom w:w="60" w:type="dxa"/>
-              <w:left w:w="100" w:type="dxa"/>
-              <w:right w:w="100" w:type="dxa"/>
-            </w:tcMar>
-          </w:tcPr>
-          <w:p>
-            <w:r>
-              <w:t>src/main/java/com/webbanhmi/entity/ChiTietDonHang.java</w:t>
-            </w:r>
-          </w:p>
-        </w:tc>
-        <w:tc>
-          <w:tcPr>
-            <w:tcW w:type="dxa" w:w="3216"/>
-            <w:tcMar>
-              <w:top w:w="60" w:type="dxa"/>
-              <w:bottom w:w="60" w:type="dxa"/>
-              <w:left w:w="100" w:type="dxa"/>
-              <w:right w:w="100" w:type="dxa"/>
-            </w:tcMar>
-          </w:tcPr>
-          <w:p>
-            <w:r>
-              <w:t>Lớp Model đại diện cho bảng chi_tiet_don_hang (soLuong, giaBan, orderId...)</w:t>
-            </w:r>
-          </w:p>
-        </w:tc>
-      </w:tr>
-    </w:tbl>
-    <w:p>
-      <w:pPr>
-        <w:pStyle w:val="Heading1"/>
-        <w:spacing w:before="240" w:after="120"/>
-      </w:pPr>
-      <w:r>
-        <w:rPr>
-          <w:rFonts w:ascii="Arial" w:hAnsi="Arial"/>
-          <w:b/>
-          <w:color w:val="D97706"/>
-          <w:sz w:val="36"/>
-        </w:rPr>
-        <w:t>3. Chi Tiết Luồng Hoạt Động &amp; Mã Nguồn Quan Trọng</w:t>
+        <w:t>CHƯƠNG 2: GIẢI THÍCH CHI TIẾT CODE GIAO DIỆN POS &amp; CHI TIẾT HÓA ĐƠN</w:t>
       </w:r>
     </w:p>
     <w:p>
       <w:pPr>
         <w:pStyle w:val="Heading2"/>
-        <w:spacing w:before="240" w:after="120"/>
+        <w:spacing w:before="280" w:after="120"/>
       </w:pPr>
       <w:r>
         <w:rPr>
@@ -569,59 +79,27 @@
           <w:color w:val="1E293B"/>
           <w:sz w:val="28"/>
         </w:rPr>
-        <w:t>3.1 Xử Lý Tạo Đơn Hàng Tại BanHangServlet.java</w:t>
+        <w:t>2.1 File pos.jsp - Bán hàng POS</w:t>
       </w:r>
     </w:p>
     <w:p>
       <w:r>
-        <w:t>Khi người dùng bấm nút Thanh Toán trên màn hình POS, request POST gửi về URL '/banhang/taohoadon'. Servlet sẽ thực hiện các bước:</w:t>
+        <w:t>Đường dẫn: src/main/webapp/views/banhang/pos.jsp</w:t>
       </w:r>
     </w:p>
     <w:p>
       <w:pPr>
-        <w:pStyle w:val="ListBullet"/>
+        <w:spacing w:before="160" w:after="40"/>
       </w:pPr>
       <w:r>
-        <w:t>1. Lấy thông tin nhân viên đang đăng nhập từ Session (user).</w:t>
+        <w:rPr>
+          <w:rFonts w:ascii="Arial" w:hAnsi="Arial"/>
+          <w:b/>
+          <w:color w:val="D97706"/>
+          <w:sz w:val="22"/>
+        </w:rPr>
+        <w:t>💻 pos.jsp - Sinh ô nhập ẩn trước khi gửi form (Line 606-644)</w:t>
       </w:r>
-    </w:p>
-    <w:p>
-      <w:pPr>
-        <w:pStyle w:val="ListBullet"/>
-      </w:pPr>
-      <w:r>
-        <w:t>2. Đọc mảng mảng ID sản phẩm (productId[]), số lượng (quantity[]) và danh sách topping (toppingIds[]).</w:t>
-      </w:r>
-    </w:p>
-    <w:p>
-      <w:pPr>
-        <w:pStyle w:val="ListBullet"/>
-      </w:pPr>
-      <w:r>
-        <w:t>3. Lặp qua các sản phẩm để tính tổng tiền (gồm giá cơ bản * số lượng + giá topping thêm).</w:t>
-      </w:r>
-    </w:p>
-    <w:p>
-      <w:pPr>
-        <w:pStyle w:val="ListBullet"/>
-      </w:pPr>
-      <w:r>
-        <w:t>4. Gọi DonHangDAO.createAndGetId(dh) để lưu đơn hàng vào CSDL SQL Server và nhận ID đơn hàng mới sinh.</w:t>
-      </w:r>
-    </w:p>
-    <w:p>
-      <w:pPr>
-        <w:pStyle w:val="ListBullet"/>
-      </w:pPr>
-      <w:r>
-        <w:t>5. Gọi ChiTietDonHangDAO để lưu danh sách món và các topping kèm theo.</w:t>
-      </w:r>
-    </w:p>
-    <w:p>
-      <w:pPr>
-        <w:spacing w:before="80" w:after="160"/>
-        <w:ind w:left="288"/>
-      </w:pPr>
     </w:p>
     <w:tbl>
       <w:tblPr>
@@ -645,7 +123,7 @@
             </w:tcMar>
             <w:tcBorders>
               <w:top w:val="single" w:sz="4" w:space="0" w:color="CBD5E1"/>
-              <w:left w:val="single" w:sz="12" w:space="0" w:color="3B82F6"/>
+              <w:left w:val="single" w:sz="12" w:space="0" w:color="D97706"/>
               <w:bottom w:val="single" w:sz="4" w:space="0" w:color="CBD5E1"/>
               <w:right w:val="single" w:sz="4" w:space="0" w:color="CBD5E1"/>
             </w:tcBorders>
@@ -660,27 +138,40 @@
                 <w:color w:val="0F172A"/>
                 <w:sz w:val="19"/>
               </w:rPr>
-              <w:t>// Đoạn mã tạo đơn hàng tại BanHangServlet.java:</w:t>
+              <w:t>function buildFormInputs() {</w:t>
               <w:br/>
-              <w:t>String maHD = "HD" + String.format("%08X", (System.currentTimeMillis() ^ (long)(Math.random() * 0xFFFFFFFFL)) &amp; 0xFFFFFFFFL);</w:t>
+              <w:t xml:space="preserve">    const container = document.getElementById('hiddenInputsContainer');</w:t>
               <w:br/>
-              <w:t>if (maHD.length() &gt; 10) maHD = maHD.substring(0, 10);</w:t>
+              <w:t xml:space="preserve">    container.innerHTML = ''; </w:t>
               <w:br/>
               <w:br/>
-              <w:t>DonHang dh = new DonHang();</w:t>
+              <w:t xml:space="preserve">    // 1. Gán ID phương thức thanh toán (Tiền mặt / Momo)</w:t>
               <w:br/>
-              <w:t>dh.setMaSoDonHang(maHD);</w:t>
+              <w:t xml:space="preserve">    const select = document.getElementById('paymentMethod');</w:t>
               <w:br/>
-              <w:t>dh.setTongTien(tongTien);</w:t>
-              <w:br/>
-              <w:t>dh.setTrangThai("COMPLETED");</w:t>
-              <w:br/>
-              <w:t>dh.setIdNhanVien(user.getId());</w:t>
-              <w:br/>
-              <w:t>dh.setIdThe(idThe &gt; 0 ? idThe : null);</w:t>
+              <w:t xml:space="preserve">    container.appendChild(createHiddenInput('idThe', select.value));</w:t>
               <w:br/>
               <w:br/>
-              <w:t>int donHangId = donHangDAO.createAndGetId(dh);</w:t>
+              <w:t xml:space="preserve">    // 2. Gán mảng productId[] và quantity[]</w:t>
+              <w:br/>
+              <w:t xml:space="preserve">    for (let id of Object.keys(orderItems)) {</w:t>
+              <w:br/>
+              <w:t xml:space="preserve">        container.appendChild(createHiddenInput('productId[]', id));</w:t>
+              <w:br/>
+              <w:t xml:space="preserve">        container.appendChild(createHiddenInput('quantity[]', orderItems[id].qty));</w:t>
+              <w:br/>
+              <w:t xml:space="preserve">    }</w:t>
+              <w:br/>
+              <w:br/>
+              <w:t xml:space="preserve">    // 3. Gán mảng toppingIds[]</w:t>
+              <w:br/>
+              <w:t xml:space="preserve">    document.querySelectorAll('.topping-cb:checked').forEach(cb =&gt; {</w:t>
+              <w:br/>
+              <w:t xml:space="preserve">        container.appendChild(createHiddenInput('toppingIds[]', cb.dataset.id));</w:t>
+              <w:br/>
+              <w:t xml:space="preserve">    });</w:t>
+              <w:br/>
+              <w:t>}</w:t>
             </w:r>
           </w:p>
         </w:tc>
@@ -689,7 +180,7 @@
     <w:p>
       <w:pPr>
         <w:pStyle w:val="Heading2"/>
-        <w:spacing w:before="240" w:after="120"/>
+        <w:spacing w:before="280" w:after="120"/>
       </w:pPr>
       <w:r>
         <w:rPr>
@@ -698,19 +189,27 @@
           <w:color w:val="1E293B"/>
           <w:sz w:val="28"/>
         </w:rPr>
-        <w:t>3.2 Xem Chi Tiết Hóa Đơn Tại InvoiceDetailServlet.java</w:t>
+        <w:t>2.2 File invoiceDetail.jsp - Giao diện Chi Tiết Hóa Đơn</w:t>
       </w:r>
     </w:p>
     <w:p>
       <w:r>
-        <w:t>Khi click vào liên kết xem chi tiết hóa đơn (URL: '/hoadon/detail?id=X'):</w:t>
+        <w:t>Đường dẫn: src/main/webapp/views/thongke/invoiceDetail.jsp</w:t>
       </w:r>
     </w:p>
     <w:p>
       <w:pPr>
-        <w:spacing w:before="80" w:after="160"/>
-        <w:ind w:left="288"/>
+        <w:spacing w:before="160" w:after="40"/>
       </w:pPr>
+      <w:r>
+        <w:rPr>
+          <w:rFonts w:ascii="Arial" w:hAnsi="Arial"/>
+          <w:b/>
+          <w:color w:val="D97706"/>
+          <w:sz w:val="22"/>
+        </w:rPr>
+        <w:t>💻 invoiceDetail.jsp - Duyệt hiển thị từng món và topping kèm theo (Line 35-60)</w:t>
+      </w:r>
     </w:p>
     <w:tbl>
       <w:tblPr>
@@ -734,7 +233,7 @@
             </w:tcMar>
             <w:tcBorders>
               <w:top w:val="single" w:sz="4" w:space="0" w:color="CBD5E1"/>
-              <w:left w:val="single" w:sz="12" w:space="0" w:color="3B82F6"/>
+              <w:left w:val="single" w:sz="12" w:space="0" w:color="D97706"/>
               <w:bottom w:val="single" w:sz="4" w:space="0" w:color="CBD5E1"/>
               <w:right w:val="single" w:sz="4" w:space="0" w:color="CBD5E1"/>
             </w:tcBorders>
@@ -749,23 +248,402 @@
                 <w:color w:val="0F172A"/>
                 <w:sz w:val="19"/>
               </w:rPr>
-              <w:t>// Đoạn mã lấy chi tiết hóa đơn tại InvoiceDetailServlet.java:</w:t>
+              <w:t>&lt;table class="table"&gt;</w:t>
               <w:br/>
-              <w:t>int id = ParamUtil.getInt(request, "id");</w:t>
+              <w:t xml:space="preserve">    &lt;thead&gt;&lt;tr&gt;&lt;th&gt;Tên Món / Topping&lt;/th&gt;&lt;th&gt;Đơn Giá&lt;/th&gt;&lt;th&gt;Số Lượng&lt;/th&gt;&lt;th&gt;Thành Tiền&lt;/th&gt;&lt;/tr&gt;&lt;/thead&gt;</w:t>
               <w:br/>
-              <w:t>if (id &gt; 0) {</w:t>
+              <w:t xml:space="preserve">    &lt;tbody&gt;</w:t>
               <w:br/>
-              <w:t xml:space="preserve">    DonHang dh = donHangDAO.findById(id);</w:t>
+              <w:t xml:space="preserve">        &lt;c:forEach var="ct" items="${dsChiTiet}"&gt;</w:t>
               <w:br/>
-              <w:t xml:space="preserve">    List&lt;ChiTietDonHang&gt; dsChiTiet = chiTietDAO.findByOrderId(id);</w:t>
+              <w:t xml:space="preserve">        &lt;tr&gt;</w:t>
               <w:br/>
-              <w:t xml:space="preserve">    request.setAttribute("donHang", dh);</w:t>
+              <w:t xml:space="preserve">            &lt;td&gt;&lt;strong&gt;&lt;c:out value="${ct.tenSp}"/&gt;&lt;/strong&gt;&lt;/td&gt;</w:t>
               <w:br/>
-              <w:t xml:space="preserve">    request.setAttribute("dsChiTiet", dsChiTiet);</w:t>
+              <w:t xml:space="preserve">            &lt;td&gt;&lt;fmt:formatNumber value="${ct.giaBan / ct.soLuong}" pattern="#,###"/&gt;đ&lt;/td&gt;</w:t>
+              <w:br/>
+              <w:t xml:space="preserve">            &lt;td&gt;${ct.soLuong}&lt;/td&gt;</w:t>
+              <w:br/>
+              <w:t xml:space="preserve">            &lt;td&gt;&lt;fmt:formatNumber value="${ct.giaBan}" pattern="#,###"/&gt;đ&lt;/td&gt;</w:t>
+              <w:br/>
+              <w:t xml:space="preserve">        &lt;/tr&gt;</w:t>
+              <w:br/>
+              <w:t xml:space="preserve">        &lt;%-- Duyệt danh sách Topping đi kèm món ăn --%&gt;</w:t>
+              <w:br/>
+              <w:t xml:space="preserve">        &lt;c:forEach var="t" items="${ct.listTopping}"&gt;</w:t>
+              <w:br/>
+              <w:t xml:space="preserve">        &lt;tr style="background:#fefce8"&gt;</w:t>
+              <w:br/>
+              <w:t xml:space="preserve">            &lt;td style="padding-left:30px;color:#d97706"&gt;+ Topping: &lt;c:out value="${t.tenNguyenLieu}"/&gt;&lt;/td&gt;</w:t>
+              <w:br/>
+              <w:t xml:space="preserve">            &lt;td&gt;+&lt;fmt:formatNumber value="${t.giaCongThem}" pattern="#,###"/&gt;đ&lt;/td&gt;</w:t>
+              <w:br/>
+              <w:t xml:space="preserve">            &lt;td&gt;1&lt;/td&gt;</w:t>
+              <w:br/>
+              <w:t xml:space="preserve">            &lt;td&gt;+&lt;fmt:formatNumber value="${t.giaCongThem}" pattern="#,###"/&gt;đ&lt;/td&gt;</w:t>
+              <w:br/>
+              <w:t xml:space="preserve">        &lt;/tr&gt;</w:t>
+              <w:br/>
+              <w:t xml:space="preserve">        &lt;/c:forEach&gt;</w:t>
+              <w:br/>
+              <w:t xml:space="preserve">        &lt;/c:forEach&gt;</w:t>
+              <w:br/>
+              <w:t xml:space="preserve">    &lt;/tbody&gt;</w:t>
+              <w:br/>
+              <w:t>&lt;/table&gt;</w:t>
+            </w:r>
+          </w:p>
+        </w:tc>
+      </w:tr>
+    </w:tbl>
+    <w:p>
+      <w:pPr>
+        <w:pStyle w:val="Heading1"/>
+        <w:spacing w:before="280" w:after="120"/>
+      </w:pPr>
+      <w:r>
+        <w:rPr>
+          <w:rFonts w:ascii="Arial" w:hAnsi="Arial"/>
+          <w:b/>
+          <w:color w:val="D97706"/>
+          <w:sz w:val="36"/>
+        </w:rPr>
+        <w:t>CHƯƠNG 3: GIẢI THÍCH CHI TIẾT MÃ NGUỒN SERVLET CONTROLLER</w:t>
+      </w:r>
+    </w:p>
+    <w:p>
+      <w:pPr>
+        <w:pStyle w:val="Heading2"/>
+        <w:spacing w:before="280" w:after="120"/>
+      </w:pPr>
+      <w:r>
+        <w:rPr>
+          <w:rFonts w:ascii="Arial" w:hAnsi="Arial"/>
+          <w:b/>
+          <w:color w:val="1E293B"/>
+          <w:sz w:val="28"/>
+        </w:rPr>
+        <w:t>3.1 BanHangServlet.java - Tạo Hóa Đơn POS</w:t>
+      </w:r>
+    </w:p>
+    <w:p>
+      <w:r>
+        <w:t>Đường dẫn: src/main/java/com/webbanhmi/servlet/BanHangServlet.java</w:t>
+      </w:r>
+    </w:p>
+    <w:p>
+      <w:pPr>
+        <w:spacing w:before="160" w:after="40"/>
+      </w:pPr>
+      <w:r>
+        <w:rPr>
+          <w:rFonts w:ascii="Arial" w:hAnsi="Arial"/>
+          <w:b/>
+          <w:color w:val="D97706"/>
+          <w:sz w:val="22"/>
+        </w:rPr>
+        <w:t>💻 BanHangServlet.java - Đọc tham số và tính tổng tiền (Line 44-85)</w:t>
+      </w:r>
+    </w:p>
+    <w:tbl>
+      <w:tblPr>
+        <w:tblW w:type="auto" w:w="0"/>
+        <w:jc w:val="center"/>
+        <w:tblLook w:firstColumn="1" w:firstRow="1" w:lastColumn="0" w:lastRow="0" w:noHBand="0" w:noVBand="1" w:val="04A0"/>
+      </w:tblPr>
+      <w:tblGrid>
+        <w:gridCol w:w="9648"/>
+      </w:tblGrid>
+      <w:tr>
+        <w:tc>
+          <w:tcPr>
+            <w:tcW w:type="dxa" w:w="9648"/>
+            <w:shd w:fill="F8FAFC"/>
+            <w:tcMar>
+              <w:top w:w="120" w:type="dxa"/>
+              <w:bottom w:w="120" w:type="dxa"/>
+              <w:left w:w="180" w:type="dxa"/>
+              <w:right w:w="180" w:type="dxa"/>
+            </w:tcMar>
+            <w:tcBorders>
+              <w:top w:val="single" w:sz="4" w:space="0" w:color="CBD5E1"/>
+              <w:left w:val="single" w:sz="12" w:space="0" w:color="D97706"/>
+              <w:bottom w:val="single" w:sz="4" w:space="0" w:color="CBD5E1"/>
+              <w:right w:val="single" w:sz="4" w:space="0" w:color="CBD5E1"/>
+            </w:tcBorders>
+          </w:tcPr>
+          <w:p>
+            <w:pPr>
+              <w:spacing w:before="40" w:after="40"/>
+            </w:pPr>
+            <w:r>
+              <w:rPr>
+                <w:rFonts w:ascii="Consolas" w:hAnsi="Consolas"/>
+                <w:color w:val="0F172A"/>
+                <w:sz w:val="19"/>
+              </w:rPr>
+              <w:t>int idThe = ParamUtil.getInt(request, "idThe");</w:t>
+              <w:br/>
+              <w:t>String[] productIds = request.getParameterValues("productId[]");</w:t>
+              <w:br/>
+              <w:t>String[] quantities = request.getParameterValues("quantity[]");</w:t>
+              <w:br/>
+              <w:t>String[] toppingIdsArr = request.getParameterValues("toppingIds[]");</w:t>
+              <w:br/>
+              <w:br/>
+              <w:t>int tongTien = 0;</w:t>
+              <w:br/>
+              <w:t>for (int i = 0; i &lt; productIds.length; i++) {</w:t>
+              <w:br/>
+              <w:t xml:space="preserve">    int pid = Integer.parseInt(productIds[i].trim());</w:t>
+              <w:br/>
+              <w:t xml:space="preserve">    int qty = Integer.parseInt(quantities[i].trim());</w:t>
+              <w:br/>
+              <w:t xml:space="preserve">    SanPham sp = sanPhamDAO.findById(pid);</w:t>
+              <w:br/>
+              <w:t xml:space="preserve">    if (sp != null) tongTien += sp.getGiaCoBan() * qty;</w:t>
               <w:br/>
               <w:t>}</w:t>
               <w:br/>
-              <w:t>request.getRequestDispatcher("/views/thongke/invoiceDetail.jsp").forward(request, response);</w:t>
+              <w:t>if (toppingIdsArr != null) {</w:t>
+              <w:br/>
+              <w:t xml:space="preserve">    for (String tid : toppingIdsArr) {</w:t>
+              <w:br/>
+              <w:t xml:space="preserve">        Topping t = toppingDAO.findById(Integer.parseInt(tid.trim()));</w:t>
+              <w:br/>
+              <w:t xml:space="preserve">        if (t != null) tongTien += t.getGiaCongThem();</w:t>
+              <w:br/>
+              <w:t xml:space="preserve">    }</w:t>
+              <w:br/>
+              <w:t>}</w:t>
+            </w:r>
+          </w:p>
+        </w:tc>
+      </w:tr>
+    </w:tbl>
+    <w:p>
+      <w:pPr>
+        <w:pStyle w:val="Heading2"/>
+        <w:spacing w:before="280" w:after="120"/>
+      </w:pPr>
+      <w:r>
+        <w:rPr>
+          <w:rFonts w:ascii="Arial" w:hAnsi="Arial"/>
+          <w:b/>
+          <w:color w:val="1E293B"/>
+          <w:sz w:val="28"/>
+        </w:rPr>
+        <w:t>3.2 InvoiceDetailServlet.java - Tra Cứu Hóa Đơn Chi Tiết</w:t>
+      </w:r>
+    </w:p>
+    <w:p>
+      <w:r>
+        <w:t>Đường dẫn: src/main/java/com/webbanhmi/servlet/InvoiceDetailServlet.java</w:t>
+      </w:r>
+    </w:p>
+    <w:p>
+      <w:pPr>
+        <w:spacing w:before="160" w:after="40"/>
+      </w:pPr>
+      <w:r>
+        <w:rPr>
+          <w:rFonts w:ascii="Arial" w:hAnsi="Arial"/>
+          <w:b/>
+          <w:color w:val="D97706"/>
+          <w:sz w:val="22"/>
+        </w:rPr>
+        <w:t>💻 InvoiceDetailServlet.java - doGet xem chi tiết</w:t>
+      </w:r>
+    </w:p>
+    <w:tbl>
+      <w:tblPr>
+        <w:tblW w:type="auto" w:w="0"/>
+        <w:jc w:val="center"/>
+        <w:tblLook w:firstColumn="1" w:firstRow="1" w:lastColumn="0" w:lastRow="0" w:noHBand="0" w:noVBand="1" w:val="04A0"/>
+      </w:tblPr>
+      <w:tblGrid>
+        <w:gridCol w:w="9648"/>
+      </w:tblGrid>
+      <w:tr>
+        <w:tc>
+          <w:tcPr>
+            <w:tcW w:type="dxa" w:w="9648"/>
+            <w:shd w:fill="F8FAFC"/>
+            <w:tcMar>
+              <w:top w:w="120" w:type="dxa"/>
+              <w:bottom w:w="120" w:type="dxa"/>
+              <w:left w:w="180" w:type="dxa"/>
+              <w:right w:w="180" w:type="dxa"/>
+            </w:tcMar>
+            <w:tcBorders>
+              <w:top w:val="single" w:sz="4" w:space="0" w:color="CBD5E1"/>
+              <w:left w:val="single" w:sz="12" w:space="0" w:color="D97706"/>
+              <w:bottom w:val="single" w:sz="4" w:space="0" w:color="CBD5E1"/>
+              <w:right w:val="single" w:sz="4" w:space="0" w:color="CBD5E1"/>
+            </w:tcBorders>
+          </w:tcPr>
+          <w:p>
+            <w:pPr>
+              <w:spacing w:before="40" w:after="40"/>
+            </w:pPr>
+            <w:r>
+              <w:rPr>
+                <w:rFonts w:ascii="Consolas" w:hAnsi="Consolas"/>
+                <w:color w:val="0F172A"/>
+                <w:sz w:val="19"/>
+              </w:rPr>
+              <w:t>@WebServlet("/hoadon/detail")</w:t>
+              <w:br/>
+              <w:t>public class InvoiceDetailServlet extends HttpServlet {</w:t>
+              <w:br/>
+              <w:t xml:space="preserve">    @Override</w:t>
+              <w:br/>
+              <w:t xml:space="preserve">    protected void doGet(HttpServletRequest request, HttpServletResponse response)</w:t>
+              <w:br/>
+              <w:t xml:space="preserve">            throws ServletException, IOException {</w:t>
+              <w:br/>
+              <w:t xml:space="preserve">        int id = ParamUtil.getInt(request, "id");</w:t>
+              <w:br/>
+              <w:t xml:space="preserve">        if (id &gt; 0) {</w:t>
+              <w:br/>
+              <w:t xml:space="preserve">            DonHang dh = donHangDAO.findById(id);</w:t>
+              <w:br/>
+              <w:t xml:space="preserve">            List&lt;ChiTietDonHang&gt; dsChiTiet = chiTietDAO.findByOrderId(id);</w:t>
+              <w:br/>
+              <w:t xml:space="preserve">            request.setAttribute("donHang", dh);</w:t>
+              <w:br/>
+              <w:t xml:space="preserve">            request.setAttribute("dsChiTiet", dsChiTiet);</w:t>
+              <w:br/>
+              <w:t xml:space="preserve">        }</w:t>
+              <w:br/>
+              <w:t xml:space="preserve">        request.getRequestDispatcher("/views/thongke/invoiceDetail.jsp").forward(request, response);</w:t>
+              <w:br/>
+              <w:t xml:space="preserve">    }</w:t>
+              <w:br/>
+              <w:t>}</w:t>
+            </w:r>
+          </w:p>
+        </w:tc>
+      </w:tr>
+    </w:tbl>
+    <w:p>
+      <w:pPr>
+        <w:pStyle w:val="Heading1"/>
+        <w:spacing w:before="280" w:after="120"/>
+      </w:pPr>
+      <w:r>
+        <w:rPr>
+          <w:rFonts w:ascii="Arial" w:hAnsi="Arial"/>
+          <w:b/>
+          <w:color w:val="D97706"/>
+          <w:sz w:val="36"/>
+        </w:rPr>
+        <w:t>CHƯƠNG 4: GIẢI THÍCH CHI TIẾT TẦNG CSDL (DAO)</w:t>
+      </w:r>
+    </w:p>
+    <w:p>
+      <w:pPr>
+        <w:pStyle w:val="Heading2"/>
+        <w:spacing w:before="280" w:after="120"/>
+      </w:pPr>
+      <w:r>
+        <w:rPr>
+          <w:rFonts w:ascii="Arial" w:hAnsi="Arial"/>
+          <w:b/>
+          <w:color w:val="1E293B"/>
+          <w:sz w:val="28"/>
+        </w:rPr>
+        <w:t>4.1 DonHangDAO.java - Lấy Generated Keys ID Hóa Đơn</w:t>
+      </w:r>
+    </w:p>
+    <w:p>
+      <w:r>
+        <w:t>Đường dẫn: src/main/java/com/webbanhmi/dao/DonHangDAO.java</w:t>
+      </w:r>
+    </w:p>
+    <w:p>
+      <w:pPr>
+        <w:spacing w:before="160" w:after="40"/>
+      </w:pPr>
+      <w:r>
+        <w:rPr>
+          <w:rFonts w:ascii="Arial" w:hAnsi="Arial"/>
+          <w:b/>
+          <w:color w:val="D97706"/>
+          <w:sz w:val="22"/>
+        </w:rPr>
+        <w:t>💻 DonHangDAO.java - createAndGetId</w:t>
+      </w:r>
+    </w:p>
+    <w:tbl>
+      <w:tblPr>
+        <w:tblW w:type="auto" w:w="0"/>
+        <w:jc w:val="center"/>
+        <w:tblLook w:firstColumn="1" w:firstRow="1" w:lastColumn="0" w:lastRow="0" w:noHBand="0" w:noVBand="1" w:val="04A0"/>
+      </w:tblPr>
+      <w:tblGrid>
+        <w:gridCol w:w="9648"/>
+      </w:tblGrid>
+      <w:tr>
+        <w:tc>
+          <w:tcPr>
+            <w:tcW w:type="dxa" w:w="9648"/>
+            <w:shd w:fill="F8FAFC"/>
+            <w:tcMar>
+              <w:top w:w="120" w:type="dxa"/>
+              <w:bottom w:w="120" w:type="dxa"/>
+              <w:left w:w="180" w:type="dxa"/>
+              <w:right w:w="180" w:type="dxa"/>
+            </w:tcMar>
+            <w:tcBorders>
+              <w:top w:val="single" w:sz="4" w:space="0" w:color="CBD5E1"/>
+              <w:left w:val="single" w:sz="12" w:space="0" w:color="D97706"/>
+              <w:bottom w:val="single" w:sz="4" w:space="0" w:color="CBD5E1"/>
+              <w:right w:val="single" w:sz="4" w:space="0" w:color="CBD5E1"/>
+            </w:tcBorders>
+          </w:tcPr>
+          <w:p>
+            <w:pPr>
+              <w:spacing w:before="40" w:after="40"/>
+            </w:pPr>
+            <w:r>
+              <w:rPr>
+                <w:rFonts w:ascii="Consolas" w:hAnsi="Consolas"/>
+                <w:color w:val="0F172A"/>
+                <w:sz w:val="19"/>
+              </w:rPr>
+              <w:t>public int createAndGetId(DonHang entity) {</w:t>
+              <w:br/>
+              <w:t xml:space="preserve">    String sql = "INSERT INTO don_hang(ma_so_don_hang, ngay_tao, tong_tien, trang_thai, id_nhan_vien, id_the) VALUES (?, GETDATE(), ?, ?, ?, ?)";</w:t>
+              <w:br/>
+              <w:t xml:space="preserve">    try (Connection conn = JdbcUtil.getConnection();</w:t>
+              <w:br/>
+              <w:t xml:space="preserve">         PreparedStatement stmt = conn.prepareStatement(sql, Statement.RETURN_GENERATED_KEYS)) {</w:t>
+              <w:br/>
+              <w:t xml:space="preserve">        stmt.setString(1, entity.getMaSoDonHang());</w:t>
+              <w:br/>
+              <w:t xml:space="preserve">        stmt.setInt(2, entity.getTongTien());</w:t>
+              <w:br/>
+              <w:t xml:space="preserve">        stmt.setString(3, entity.getTrangThai());</w:t>
+              <w:br/>
+              <w:t xml:space="preserve">        stmt.setInt(4, entity.getIdNhanVien());</w:t>
+              <w:br/>
+              <w:t xml:space="preserve">        if (entity.getIdThe() != null) stmt.setInt(5, entity.getIdThe());</w:t>
+              <w:br/>
+              <w:t xml:space="preserve">        else stmt.setNull(5, Types.INTEGER);</w:t>
+              <w:br/>
+              <w:br/>
+              <w:t xml:space="preserve">        stmt.executeUpdate();</w:t>
+              <w:br/>
+              <w:t xml:space="preserve">        ResultSet rs = stmt.getGeneratedKeys();</w:t>
+              <w:br/>
+              <w:t xml:space="preserve">        if (rs.next()) return rs.getInt(1);</w:t>
+              <w:br/>
+              <w:t xml:space="preserve">    } catch (Exception e) { e.printStackTrace(); }</w:t>
+              <w:br/>
+              <w:t xml:space="preserve">    return 0;</w:t>
+              <w:br/>
+              <w:t>}</w:t>
             </w:r>
           </w:p>
         </w:tc>

</xml_diff>